<commit_message>
Nach abschluss der dritten LV - vorbereitung der Präsis für 4 und 5
</commit_message>
<xml_diff>
--- a/docs/2_messung/steckbrief.docx
+++ b/docs/2_messung/steckbrief.docx
@@ -15,7 +15,7 @@
         <w:pStyle w:val="Author"/>
       </w:pPr>
     </w:p>
-    <w:bookmarkStart w:id="29" w:name="steckbrief-name-des-verfahrens"/>
+    <w:bookmarkStart w:id="18" w:name="steckbrief-name-des-verfahrens"/>
     <w:p>
       <w:pPr>
         <w:pStyle w:val="Heading1"/>
@@ -24,7 +24,7 @@
         <w:t xml:space="preserve">Steckbrief: [Name des Verfahrens]</w:t>
       </w:r>
     </w:p>
-    <w:bookmarkStart w:id="20" w:name="allgemeine-informationen"/>
+    <w:bookmarkStart w:id="9" w:name="allgemeine-informationen"/>
     <w:p>
       <w:pPr>
         <w:pStyle w:val="Heading2"/>
@@ -173,8 +173,8 @@
         <w:t xml:space="preserve">| |</w:t>
       </w:r>
     </w:p>
-    <w:bookmarkEnd w:id="20"/>
-    <w:bookmarkStart w:id="21" w:name="beschreibung"/>
+    <w:bookmarkEnd w:id="9"/>
+    <w:bookmarkStart w:id="10" w:name="beschreibung"/>
     <w:p>
       <w:pPr>
         <w:pStyle w:val="Heading2"/>
@@ -237,8 +237,8 @@
         <w:t xml:space="preserve">( ☐ nominal / ☐ ordinal / ☐ intervall / ☐ metrisch / ☐ absolut)</w:t>
       </w:r>
     </w:p>
-    <w:bookmarkEnd w:id="21"/>
-    <w:bookmarkStart w:id="22" w:name="gütekriterien"/>
+    <w:bookmarkEnd w:id="10"/>
+    <w:bookmarkStart w:id="11" w:name="gütekriterien"/>
     <w:p>
       <w:pPr>
         <w:pStyle w:val="Heading2"/>
@@ -255,8 +255,8 @@
         <w:t xml:space="preserve">Welche Angaben werden zu Gütekriterien gemacht (u.a. Objektivität, Reliabilität, Validität)?</w:t>
       </w:r>
     </w:p>
-    <w:bookmarkEnd w:id="22"/>
-    <w:bookmarkStart w:id="23" w:name="anwendbarkeit"/>
+    <w:bookmarkEnd w:id="11"/>
+    <w:bookmarkStart w:id="12" w:name="anwendbarkeit"/>
     <w:p>
       <w:pPr>
         <w:pStyle w:val="Heading2"/>
@@ -447,8 +447,8 @@
         </w:tc>
       </w:tr>
     </w:tbl>
-    <w:bookmarkEnd w:id="23"/>
-    <w:bookmarkStart w:id="24" w:name="praktische-informationen"/>
+    <w:bookmarkEnd w:id="12"/>
+    <w:bookmarkStart w:id="13" w:name="praktische-informationen"/>
     <w:p>
       <w:pPr>
         <w:pStyle w:val="Heading2"/>
@@ -511,8 +511,8 @@
         <w:t xml:space="preserve">(__________ Minuten / Stunden / Tage)</w:t>
       </w:r>
     </w:p>
-    <w:bookmarkEnd w:id="24"/>
-    <w:bookmarkStart w:id="25" w:name="einordnung"/>
+    <w:bookmarkEnd w:id="13"/>
+    <w:bookmarkStart w:id="14" w:name="einordnung"/>
     <w:p>
       <w:pPr>
         <w:pStyle w:val="Heading2"/>
@@ -599,8 +599,8 @@
         <w:t xml:space="preserve">Andere:</w:t>
       </w:r>
     </w:p>
-    <w:bookmarkEnd w:id="25"/>
-    <w:bookmarkStart w:id="26" w:name="stärken-und-schwächen"/>
+    <w:bookmarkEnd w:id="14"/>
+    <w:bookmarkStart w:id="15" w:name="stärken-und-schwächen"/>
     <w:p>
       <w:pPr>
         <w:pStyle w:val="Heading2"/>
@@ -701,8 +701,8 @@
         </w:tc>
       </w:tr>
     </w:tbl>
-    <w:bookmarkEnd w:id="26"/>
-    <w:bookmarkStart w:id="27" w:name="anwendungsbeispiele"/>
+    <w:bookmarkEnd w:id="15"/>
+    <w:bookmarkStart w:id="16" w:name="anwendungsbeispiele"/>
     <w:p>
       <w:pPr>
         <w:pStyle w:val="Heading2"/>
@@ -719,8 +719,8 @@
         <w:t xml:space="preserve">(Kurze Beschreibung einer Studie, in der das Verfahren eingesetzt wurde)</w:t>
       </w:r>
     </w:p>
-    <w:bookmarkEnd w:id="27"/>
-    <w:bookmarkStart w:id="28" w:name="quellen"/>
+    <w:bookmarkEnd w:id="16"/>
+    <w:bookmarkStart w:id="17" w:name="quellen"/>
     <w:p>
       <w:pPr>
         <w:pStyle w:val="Heading2"/>
@@ -744,8 +744,8 @@
         </w:pict>
       </w:r>
     </w:p>
-    <w:bookmarkEnd w:id="28"/>
-    <w:bookmarkEnd w:id="29"/>
+    <w:bookmarkEnd w:id="17"/>
+    <w:bookmarkEnd w:id="18"/>
     <w:sectPr>
       <w:footnotePr>
         <w:numRestart w:val="eachSect"/>

</xml_diff>